<commit_message>
Update title to Performance Marketing & AI Analytics Lead
</commit_message>
<xml_diff>
--- a/Mujtaba_Sajawal_Marketing_AI_Analytics_Lead_Resume.docx
+++ b/Mujtaba_Sajawal_Marketing_AI_Analytics_Lead_Resume.docx
@@ -63,7 +63,7 @@
           <w:color w:val="1A1A2E"/>
           <w:sz w:val="20"/>
         </w:rPr>
-        <w:t>Marketing AI &amp; Analytics Lead  |  10+ Years Experience</w:t>
+        <w:t>Performance Marketing &amp; AI Analytics Lead  |  10+ Years Experience</w:t>
       </w:r>
     </w:p>
     <w:p>
@@ -109,7 +109,7 @@
           <w:color w:val="1A1A2E"/>
           <w:sz w:val="19"/>
         </w:rPr>
-        <w:t>Results-driven Marketing AI &amp; Analytics Lead with 10+ years of experience sitting at the intersection of marketing measurement, business intelligence, and AI enablement. Specializes in owning end-to-end attribution frameworks, establishing single-source-of-truth (SSOT) reporting systems, and driving organization-wide AI transformation. Proven builder and operator with hands-on experience engineering autonomous AI agents, custom scraper pipelines, locally-hosted CRM dashboards, and automated report pipelines (Python, APIs, webhooks, Power Automate, Make) that reduce operational effort by 40%. Managed budgets up to AED 35M and bridged advanced analytics with practical AI implementations to optimize CAC and maximize marketing efficiency.</w:t>
+        <w:t>Results-driven Performance Marketing &amp; AI Analytics Lead with 10+ years of experience sitting at the intersection of marketing measurement, business intelligence, and AI enablement. Specializes in owning end-to-end attribution frameworks, establishing single-source-of-truth (SSOT) reporting systems, and driving organization-wide AI transformation. Proven builder and operator with hands-on experience engineering autonomous AI agents, custom scraper pipelines, locally-hosted CRM dashboards, and automated report pipelines (Python, APIs, webhooks, Power Automate, Make) that reduce operational effort by 40%. Managed budgets up to AED 35M and bridged advanced analytics with practical AI implementations to optimize CAC and maximize marketing efficiency.</w:t>
       </w:r>
     </w:p>
     <w:p>

</xml_diff>